<commit_message>
Locandina: codice patrocinio A.P.C. 0106/2026, sede OHANA e Via Macaggi per l'ultima lezione, via crediti COA
Co-Authored-By: Claude Sonnet 5.5 <noreply@anthropic.com>
Claude-Session: https://claude.ai/code/session_01LX9FZWdBfUgQ9CRPKkKsTu
</commit_message>
<xml_diff>
--- a/locandina_corso.docx
+++ b/locandina_corso.docx
@@ -77,7 +77,7 @@
                 <w:sz w:val="16"/>
                 <w:szCs w:val="16"/>
               </w:rPr>
-              <w:t>Crediti richiesti ad A.I.Me.F. per i mediatori familiari e al COA Genova per gli avvocati</w:t>
+              <w:t>Cod. Patrocinio e Riconoscimento A.P.C. n. 0106/2026 · Prot. 199/2026 · Piazza della Vittoria 6/8, Genova</w:t>
             </w:r>
           </w:p>
         </w:tc>
@@ -1351,6 +1351,17 @@
                 <w:szCs w:val="17"/>
               </w:rPr>
               <w:t>Simulazioni pratiche e conclusione (laboratorio)</w:t>
+            </w:r>
+            <w:r>
+              <w:rPr>
+                <w:rFonts w:ascii="Century Schoolbook" w:eastAsia="Century Schoolbook" w:hAnsi="Century Schoolbook" w:cs="Century Schoolbook"/>
+                <w:b/>
+                <w:bCs/>
+                <w:color w:val="B45309"/>
+                <w:sz w:val="14"/>
+                <w:szCs w:val="14"/>
+              </w:rPr>
+              <w:t xml:space="preserve">  ·  Via Macaggi 23/4, Genova</w:t>
             </w:r>
           </w:p>
         </w:tc>
@@ -1754,23 +1765,6 @@
         </w:tc>
       </w:tr>
     </w:tbl>
-    <w:p>
-      <w:pPr>
-        <w:spacing w:before="100"/>
-        <w:jc w:val="center"/>
-      </w:pPr>
-      <w:r>
-        <w:rPr>
-          <w:rFonts w:ascii="Century Schoolbook" w:eastAsia="Century Schoolbook" w:hAnsi="Century Schoolbook" w:cs="Century Schoolbook"/>
-          <w:i/>
-          <w:iCs/>
-          <w:color w:val="AAAAAA"/>
-          <w:sz w:val="14"/>
-          <w:szCs w:val="14"/>
-        </w:rPr>
-        <w:t>Crediti richiesti ad A.I.Me.F. per i mediatori familiari Crediti richiesti al COA Genova per gli avvocati mediatori familiari</w:t>
-      </w:r>
-    </w:p>
     <w:sectPr>
       <w:pgSz w:w="11906" w:h="16838"/>
       <w:pgMar w:top="560" w:right="700" w:bottom="560" w:left="700" w:header="708" w:footer="708" w:gutter="0"/>

</xml_diff>